<commit_message>
added DBt link files + ingestion to GCPsTORAGE  + Parquet issue fix
</commit_message>
<xml_diff>
--- a/week_4_DBT/dbt_readme.docx
+++ b/week_4_DBT/dbt_readme.docx
@@ -53,19 +53,9 @@
     </w:p>
     <w:p/>
     <w:p>
-      <w:proofErr w:type="spellStart"/>
-      <w:r>
-        <w:t>Elt</w:t>
-      </w:r>
-      <w:proofErr w:type="spellEnd"/>
-      <w:r>
-        <w:t xml:space="preserve"> – is more flexible and faster since the data is already in our </w:t>
-      </w:r>
-      <w:proofErr w:type="spellStart"/>
-      <w:r>
-        <w:t>db</w:t>
-      </w:r>
-      <w:proofErr w:type="spellEnd"/>
+      <w:r>
+        <w:t>Elt – is more flexible and faster since the data is already in our db</w:t>
+      </w:r>
     </w:p>
     <w:p/>
     <w:p>
@@ -84,19 +74,7 @@
         <w:rPr>
           <w:lang w:val="en-IL"/>
         </w:rPr>
-        <w:t xml:space="preserve">Kimball Dimensional </w:t>
-      </w:r>
-      <w:r>
-        <w:rPr>
-          <w:lang w:val="en-IL"/>
-        </w:rPr>
-        <w:t>Modelling</w:t>
-      </w:r>
-      <w:r>
-        <w:rPr>
-          <w:lang w:val="en-IL"/>
-        </w:rPr>
-        <w:t xml:space="preserve"> is a methodology for designing data warehouses, developed by </w:t>
+        <w:t xml:space="preserve">Kimball Dimensional Modelling is a methodology for designing data warehouses, developed by </w:t>
       </w:r>
       <w:r>
         <w:rPr>
@@ -118,15 +96,7 @@
           <w:bCs/>
           <w:lang w:val="en-IL"/>
         </w:rPr>
-        <w:t xml:space="preserve">easier to access and </w:t>
-      </w:r>
-      <w:r>
-        <w:rPr>
-          <w:b/>
-          <w:bCs/>
-          <w:lang w:val="en-IL"/>
-        </w:rPr>
-        <w:t>analyse</w:t>
+        <w:t>easier to access and analyse</w:t>
       </w:r>
       <w:r>
         <w:rPr>
@@ -251,25 +221,7 @@
           <w:bCs/>
           <w:lang w:val="en-IL"/>
         </w:rPr>
-        <w:t xml:space="preserve">Key Concepts of Kimball Dimensional </w:t>
-      </w:r>
-      <w:proofErr w:type="spellStart"/>
-      <w:r>
-        <w:rPr>
-          <w:b/>
-          <w:bCs/>
-          <w:lang w:val="en-IL"/>
-        </w:rPr>
-        <w:t>Modeling</w:t>
-      </w:r>
-      <w:proofErr w:type="spellEnd"/>
-      <w:r>
-        <w:rPr>
-          <w:b/>
-          <w:bCs/>
-          <w:lang w:val="en-IL"/>
-        </w:rPr>
-        <w:t>:</w:t>
+        <w:t>Key Concepts of Kimball Dimensional Modeling:</w:t>
       </w:r>
     </w:p>
     <w:p>
@@ -294,21 +246,7 @@
         <w:rPr>
           <w:lang w:val="en-IL"/>
         </w:rPr>
-        <w:t xml:space="preserve"> – The primary structure of Kimball </w:t>
-      </w:r>
-      <w:proofErr w:type="spellStart"/>
-      <w:r>
-        <w:rPr>
-          <w:lang w:val="en-IL"/>
-        </w:rPr>
-        <w:t>modeling</w:t>
-      </w:r>
-      <w:proofErr w:type="spellEnd"/>
-      <w:r>
-        <w:rPr>
-          <w:lang w:val="en-IL"/>
-        </w:rPr>
-        <w:t xml:space="preserve">, where a </w:t>
+        <w:t xml:space="preserve"> – The primary structure of Kimball modeling, where a </w:t>
       </w:r>
       <w:r>
         <w:rPr>
@@ -511,25 +449,7 @@
           <w:bCs/>
           <w:lang w:val="en-IL"/>
         </w:rPr>
-        <w:t>Slowly Changing Dimensions (</w:t>
-      </w:r>
-      <w:proofErr w:type="spellStart"/>
-      <w:r>
-        <w:rPr>
-          <w:b/>
-          <w:bCs/>
-          <w:lang w:val="en-IL"/>
-        </w:rPr>
-        <w:t>SCDs</w:t>
-      </w:r>
-      <w:proofErr w:type="spellEnd"/>
-      <w:r>
-        <w:rPr>
-          <w:b/>
-          <w:bCs/>
-          <w:lang w:val="en-IL"/>
-        </w:rPr>
-        <w:t>)</w:t>
+        <w:t>Slowly Changing Dimensions (SCDs)</w:t>
       </w:r>
       <w:r>
         <w:rPr>
@@ -630,25 +550,7 @@
           <w:bCs/>
           <w:lang w:val="en-IL"/>
         </w:rPr>
-        <w:t xml:space="preserve">Advantages of Kimball Dimensional </w:t>
-      </w:r>
-      <w:proofErr w:type="spellStart"/>
-      <w:r>
-        <w:rPr>
-          <w:b/>
-          <w:bCs/>
-          <w:lang w:val="en-IL"/>
-        </w:rPr>
-        <w:t>Modeling</w:t>
-      </w:r>
-      <w:proofErr w:type="spellEnd"/>
-      <w:r>
-        <w:rPr>
-          <w:b/>
-          <w:bCs/>
-          <w:lang w:val="en-IL"/>
-        </w:rPr>
-        <w:t>:</w:t>
+        <w:t>Advantages of Kimball Dimensional Modeling:</w:t>
       </w:r>
     </w:p>
     <w:p>
@@ -817,25 +719,7 @@
           <w:bCs/>
           <w:lang w:val="en-IL"/>
         </w:rPr>
-        <w:t>Fact Table (</w:t>
-      </w:r>
-      <w:proofErr w:type="spellStart"/>
-      <w:r>
-        <w:rPr>
-          <w:b/>
-          <w:bCs/>
-          <w:lang w:val="en-IL"/>
-        </w:rPr>
-        <w:t>Sales_Fact</w:t>
-      </w:r>
-      <w:proofErr w:type="spellEnd"/>
-      <w:r>
-        <w:rPr>
-          <w:b/>
-          <w:bCs/>
-          <w:lang w:val="en-IL"/>
-        </w:rPr>
-        <w:t>)</w:t>
+        <w:t>Fact Table (Sales_Fact)</w:t>
       </w:r>
       <w:r>
         <w:rPr>
@@ -879,7 +763,6 @@
           <w:lang w:val="en-IL"/>
         </w:rPr>
       </w:pPr>
-      <w:proofErr w:type="spellStart"/>
       <w:r>
         <w:rPr>
           <w:b/>
@@ -888,7 +771,6 @@
         </w:rPr>
         <w:t>Customer_Dim</w:t>
       </w:r>
-      <w:proofErr w:type="spellEnd"/>
       <w:r>
         <w:rPr>
           <w:lang w:val="en-IL"/>
@@ -906,7 +788,6 @@
           <w:lang w:val="en-IL"/>
         </w:rPr>
       </w:pPr>
-      <w:proofErr w:type="spellStart"/>
       <w:r>
         <w:rPr>
           <w:b/>
@@ -915,7 +796,6 @@
         </w:rPr>
         <w:t>Product_Dim</w:t>
       </w:r>
-      <w:proofErr w:type="spellEnd"/>
       <w:r>
         <w:rPr>
           <w:lang w:val="en-IL"/>
@@ -933,7 +813,6 @@
           <w:lang w:val="en-IL"/>
         </w:rPr>
       </w:pPr>
-      <w:proofErr w:type="spellStart"/>
       <w:r>
         <w:rPr>
           <w:b/>
@@ -943,7 +822,6 @@
         <w:lastRenderedPageBreak/>
         <w:t>Time_Dim</w:t>
       </w:r>
-      <w:proofErr w:type="spellEnd"/>
       <w:r>
         <w:rPr>
           <w:lang w:val="en-IL"/>
@@ -960,47 +838,18 @@
     </w:p>
     <w:p>
       <w:r>
-        <w:t xml:space="preserve">What is </w:t>
-      </w:r>
-      <w:proofErr w:type="spellStart"/>
-      <w:r>
-        <w:t>dbt</w:t>
-      </w:r>
-      <w:proofErr w:type="spellEnd"/>
-      <w:r>
-        <w:t xml:space="preserve"> (Data Build Tool)?</w:t>
-      </w:r>
-    </w:p>
-    <w:p>
-      <w:proofErr w:type="spellStart"/>
-      <w:r>
-        <w:t>dbt</w:t>
-      </w:r>
-      <w:proofErr w:type="spellEnd"/>
-      <w:r>
-        <w:t xml:space="preserve"> (Data Build Tool) is an open-source data transformation tool that helps analysts and engineers write, test, and manage SQL-based transformations inside a data warehouse. It is widely used for modern data engineering in cloud-based environments like Snowflake, </w:t>
-      </w:r>
-      <w:proofErr w:type="spellStart"/>
-      <w:r>
-        <w:t>BigQuery</w:t>
-      </w:r>
-      <w:proofErr w:type="spellEnd"/>
-      <w:r>
-        <w:t>, Redshift, and Databricks.</w:t>
+        <w:t>What is dbt (Data Build Tool)?</w:t>
+      </w:r>
+    </w:p>
+    <w:p>
+      <w:r>
+        <w:t>dbt (Data Build Tool) is an open-source data transformation tool that helps analysts and engineers write, test, and manage SQL-based transformations inside a data warehouse. It is widely used for modern data engineering in cloud-based environments like Snowflake, BigQuery, Redshift, and Databricks.</w:t>
       </w:r>
     </w:p>
     <w:p/>
     <w:p>
       <w:r>
-        <w:t xml:space="preserve">Why Use </w:t>
-      </w:r>
-      <w:proofErr w:type="spellStart"/>
-      <w:r>
-        <w:t>dbt</w:t>
-      </w:r>
-      <w:proofErr w:type="spellEnd"/>
-      <w:r>
-        <w:t>?</w:t>
+        <w:t>Why Use dbt?</w:t>
       </w:r>
     </w:p>
     <w:p>
@@ -1073,25 +922,7 @@
           <w:bCs/>
           <w:lang w:val="en-IL"/>
         </w:rPr>
-        <w:t xml:space="preserve">How Does </w:t>
-      </w:r>
-      <w:proofErr w:type="spellStart"/>
-      <w:r>
-        <w:rPr>
-          <w:b/>
-          <w:bCs/>
-          <w:lang w:val="en-IL"/>
-        </w:rPr>
-        <w:t>dbt</w:t>
-      </w:r>
-      <w:proofErr w:type="spellEnd"/>
-      <w:r>
-        <w:rPr>
-          <w:b/>
-          <w:bCs/>
-          <w:lang w:val="en-IL"/>
-        </w:rPr>
-        <w:t xml:space="preserve"> Work?</w:t>
+        <w:t>How Does dbt Work?</w:t>
       </w:r>
     </w:p>
     <w:p>
@@ -1130,21 +961,7 @@
         <w:rPr>
           <w:lang w:val="en-IL"/>
         </w:rPr>
-        <w:t xml:space="preserve"> (e.g., Snowflake, </w:t>
-      </w:r>
-      <w:proofErr w:type="spellStart"/>
-      <w:r>
-        <w:rPr>
-          <w:lang w:val="en-IL"/>
-        </w:rPr>
-        <w:t>BigQuery</w:t>
-      </w:r>
-      <w:proofErr w:type="spellEnd"/>
-      <w:r>
-        <w:rPr>
-          <w:lang w:val="en-IL"/>
-        </w:rPr>
-        <w:t>).</w:t>
+        <w:t xml:space="preserve"> (e.g., Snowflake, BigQuery).</w:t>
       </w:r>
     </w:p>
     <w:p>
@@ -1163,18 +980,8 @@
           <w:bCs/>
           <w:lang w:val="en-IL"/>
         </w:rPr>
-        <w:t xml:space="preserve">Transform Data with </w:t>
-      </w:r>
-      <w:proofErr w:type="spellStart"/>
-      <w:r>
-        <w:rPr>
-          <w:b/>
-          <w:bCs/>
-          <w:lang w:val="en-IL"/>
-        </w:rPr>
-        <w:t>dbt</w:t>
-      </w:r>
-      <w:proofErr w:type="spellEnd"/>
+        <w:t>Transform Data with dbt</w:t>
+      </w:r>
       <w:r>
         <w:rPr>
           <w:lang w:val="en-IL"/>
@@ -1218,21 +1025,7 @@
         <w:rPr>
           <w:lang w:val="en-IL"/>
         </w:rPr>
-        <w:t xml:space="preserve"> – </w:t>
-      </w:r>
-      <w:proofErr w:type="spellStart"/>
-      <w:r>
-        <w:rPr>
-          <w:lang w:val="en-IL"/>
-        </w:rPr>
-        <w:t>dbt</w:t>
-      </w:r>
-      <w:proofErr w:type="spellEnd"/>
-      <w:r>
-        <w:rPr>
-          <w:lang w:val="en-IL"/>
-        </w:rPr>
-        <w:t xml:space="preserve"> compiles SQL models, executes them, and validates data quality.</w:t>
+        <w:t xml:space="preserve"> – dbt compiles SQL models, executes them, and validates data quality.</w:t>
       </w:r>
     </w:p>
     <w:p>
@@ -1257,21 +1050,7 @@
         <w:rPr>
           <w:lang w:val="en-IL"/>
         </w:rPr>
-        <w:t xml:space="preserve"> – Use </w:t>
-      </w:r>
-      <w:proofErr w:type="spellStart"/>
-      <w:r>
-        <w:rPr>
-          <w:lang w:val="en-IL"/>
-        </w:rPr>
-        <w:t>dbt</w:t>
-      </w:r>
-      <w:proofErr w:type="spellEnd"/>
-      <w:r>
-        <w:rPr>
-          <w:lang w:val="en-IL"/>
-        </w:rPr>
-        <w:t xml:space="preserve"> Cloud or a scheduler (like Airflow) for production workflows.</w:t>
+        <w:t xml:space="preserve"> – Use dbt Cloud or a scheduler (like Airflow) for production workflows.</w:t>
       </w:r>
     </w:p>
     <w:p>
@@ -1304,6 +1083,76 @@
         </w:rPr>
         <w:t xml:space="preserve">power bi </w:t>
       </w:r>
+    </w:p>
+    <w:p>
+      <w:pPr>
+        <w:rPr>
+          <w:lang w:val="en-IL"/>
+        </w:rPr>
+      </w:pPr>
+    </w:p>
+    <w:p>
+      <w:pPr>
+        <w:rPr>
+          <w:lang w:val="en-IL"/>
+        </w:rPr>
+      </w:pPr>
+    </w:p>
+    <w:p>
+      <w:pPr>
+        <w:rPr>
+          <w:lang w:val="en-IL"/>
+        </w:rPr>
+      </w:pPr>
+      <w:r>
+        <w:rPr>
+          <w:lang w:val="en-IL"/>
+        </w:rPr>
+        <w:t>For dbt repo</w:t>
+      </w:r>
+    </w:p>
+    <w:p>
+      <w:pPr>
+        <w:rPr>
+          <w:lang w:val="en-IL"/>
+        </w:rPr>
+      </w:pPr>
+      <w:hyperlink r:id="rId6" w:history="1">
+        <w:r>
+          <w:rPr>
+            <w:rStyle w:val="Hyperlink"/>
+            <w:lang w:val="en-IL"/>
+          </w:rPr>
+          <w:t>https://github.com/JOHNFFFEE/dbt-datacamp2025DE</w:t>
+        </w:r>
+      </w:hyperlink>
+    </w:p>
+    <w:p>
+      <w:pPr>
+        <w:rPr>
+          <w:lang w:val="en-IL"/>
+        </w:rPr>
+      </w:pPr>
+    </w:p>
+    <w:p>
+      <w:pPr>
+        <w:rPr>
+          <w:lang w:val="en-IL"/>
+        </w:rPr>
+      </w:pPr>
+      <w:r>
+        <w:rPr>
+          <w:lang w:val="en-IL"/>
+        </w:rPr>
+        <w:t>Need to update the core,staging seed explanations</w:t>
+      </w:r>
+    </w:p>
+    <w:p>
+      <w:pPr>
+        <w:rPr>
+          <w:lang w:val="en-IL"/>
+        </w:rPr>
+      </w:pPr>
     </w:p>
     <w:p>
       <w:pPr>
@@ -2314,6 +2163,7 @@
   <w:style w:type="character" w:default="1" w:styleId="DefaultParagraphFont">
     <w:name w:val="Default Paragraph Font"/>
     <w:uiPriority w:val="1"/>
+    <w:semiHidden/>
     <w:unhideWhenUsed/>
   </w:style>
   <w:style w:type="table" w:default="1" w:styleId="TableNormal">
@@ -2625,6 +2475,29 @@
       <w:smallCaps/>
       <w:color w:val="2E74B5" w:themeColor="accent1" w:themeShade="BF"/>
       <w:spacing w:val="5"/>
+    </w:rPr>
+  </w:style>
+  <w:style w:type="character" w:styleId="Hyperlink">
+    <w:name w:val="Hyperlink"/>
+    <w:basedOn w:val="DefaultParagraphFont"/>
+    <w:uiPriority w:val="99"/>
+    <w:unhideWhenUsed/>
+    <w:rsid w:val="001C2E54"/>
+    <w:rPr>
+      <w:color w:val="0563C1" w:themeColor="hyperlink"/>
+      <w:u w:val="single"/>
+    </w:rPr>
+  </w:style>
+  <w:style w:type="character" w:styleId="UnresolvedMention">
+    <w:name w:val="Unresolved Mention"/>
+    <w:basedOn w:val="DefaultParagraphFont"/>
+    <w:uiPriority w:val="99"/>
+    <w:semiHidden/>
+    <w:unhideWhenUsed/>
+    <w:rsid w:val="001C2E54"/>
+    <w:rPr>
+      <w:color w:val="605E5C"/>
+      <w:shd w:val="clear" w:color="auto" w:fill="E1DFDD"/>
     </w:rPr>
   </w:style>
 </w:styles>

</xml_diff>